<commit_message>
docs(thesis): restructure report to fit 80-page cap with appendix A-I
- Move reference material (endpoint table, use case specs, .env/Flyway
  tables, screenshots) into 09-phu-luc.md (Phu luc A-I, not counted
  toward the cap)
- Ch1: drop 3 sections duplicated in MO DAU, renumber 1.7->1.4, 1.8->1.5
- Ch4: move 4.7 environment config to Phu luc F.4-F.6
- Fix 18 cross-chapter numeric contradictions (15 Flyway migrations,
  11 Maven submodules, 39 endpoints, 253 backend + 21 frontend tests,
  8 technical contributions, telegrambots 6.9.7.1)
- Patch reference.docx styles (Compact single-spaced, SourceCode,
  cover-page styles) — arabic-numbered body now 78 pages <= 80
- Delete chuong-6-mo-rong.md (superseded by Phu luc I)
- Add build.sh + render-mermaid.py pipeline, thesis-v2 (4-chapter
  template variant), project CLAUDE.md
</commit_message>
<xml_diff>
--- a/docs/thesis/de-cuong.docx
+++ b/docs/thesis/de-cuong.docx
@@ -102,7 +102,7 @@
         <w:t xml:space="preserve"> </w:t>
       </w:r>
       <w:r>
-        <w:t xml:space="preserve">[HỌC HÀM, HỌC VỊ — HỌ TÊN GVHD]</w:t>
+        <w:t xml:space="preserve">ThS. Đinh Tuấn Long</w:t>
       </w:r>
     </w:p>
     <w:p>
@@ -126,7 +126,7 @@
         </w:numPr>
       </w:pPr>
       <w:r>
-        <w:t xml:space="preserve">Lê Thị Trần Thủy (Nhóm trưởng) — MSV: [MSSV]; Lớp: [LỚP]</w:t>
+        <w:t xml:space="preserve">Lê Thị Trần Thủy (Nhóm trưởng) — MSV: 23C1001P3734</w:t>
       </w:r>
     </w:p>
     <w:p>
@@ -138,7 +138,7 @@
         </w:numPr>
       </w:pPr>
       <w:r>
-        <w:t xml:space="preserve">Ngô Phúc Hiếu — MSV: [MSSV]; Lớp: [LỚP]</w:t>
+        <w:t xml:space="preserve">Ngô Phúc Hiếu — MSV: 23C1001P5290</w:t>
       </w:r>
     </w:p>
     <w:p>
@@ -150,7 +150,25 @@
         </w:numPr>
       </w:pPr>
       <w:r>
-        <w:t xml:space="preserve">Nguyễn Thế Thưởng — MSV: [MSSV]; Lớp: [LỚP]</w:t>
+        <w:t xml:space="preserve">Nguyễn Thế Thưởng — MSV: 23C1001P4046</w:t>
+      </w:r>
+    </w:p>
+    <w:p>
+      <w:pPr>
+        <w:pStyle w:val="TrangBia"/>
+      </w:pPr>
+      <w:r>
+        <w:rPr>
+          <w:b/>
+          <w:bCs/>
+        </w:rPr>
+        <w:t xml:space="preserve">Lớp:</w:t>
+      </w:r>
+      <w:r>
+        <w:t xml:space="preserve"> </w:t>
+      </w:r>
+      <w:r>
+        <w:t xml:space="preserve">CHDN420</w:t>
       </w:r>
     </w:p>
     <w:p>
@@ -2463,7 +2481,7 @@
         <w:pStyle w:val="FirstParagraph"/>
       </w:pPr>
       <w:r>
-        <w:t xml:space="preserve">Đề tài do nhóm 3 sinh viên thực hiện. Lê Thị Trần Thủy giữ vai trò nhóm trưởng, phụ trách khối lượng công việc lớn nhất (kiến trúc tổng thể, backend cốt lõi, tích hợp Telegram và VNPay, kiểm thử và triển khai).</w:t>
+        <w:t xml:space="preserve">Đề tài do nhóm 3 sinh viên thực hiện, phân công cân bằng khối lượng. Nhóm trưởng Lê Thị Trần Thủy tập trung toàn bộ vào lập trình phần lõi (kiến trúc, backend và các tích hợp Telegram/VNPay); phần frontend, kiểm thử, triển khai, bảo mật và viết báo cáo được chia đều cho hai thành viên còn lại.</w:t>
       </w:r>
     </w:p>
     <w:tbl>
@@ -2541,12 +2559,6 @@
             <w:r>
               <w:t xml:space="preserve">- Tích hợp Telegram (Bot, Mini App, Live Location) và cổng thanh toán VNPay</w:t>
             </w:r>
-            <w:r>
-              <w:t xml:space="preserve">- Bảo mật defense-in-depth, kiểm thử (TDD) và đóng gói Docker Compose</w:t>
-            </w:r>
-            <w:r>
-              <w:t xml:space="preserve">- Tổng hợp, viết tài liệu và báo cáo khóa luận</w:t>
-            </w:r>
           </w:p>
         </w:tc>
       </w:tr>
@@ -2569,13 +2581,13 @@
               <w:pStyle w:val="Compact"/>
             </w:pPr>
             <w:r>
-              <w:t xml:space="preserve">- Lập trình Frontend Web Admin (React + Tailwind)</w:t>
+              <w:t xml:space="preserve">- Lập trình Frontend Web Admin (React + Tailwind): quản lý sản phẩm, đơn hàng (CRUD), Dashboard KPI và biểu đồ (Recharts)</w:t>
             </w:r>
             <w:r>
-              <w:t xml:space="preserve">- Module quản lý sản phẩm và đơn hàng (CRUD)</w:t>
+              <w:t xml:space="preserve">- Kiểm thử (TDD) và đóng gói Docker Compose</w:t>
             </w:r>
             <w:r>
-              <w:t xml:space="preserve">- Dashboard KPI và biểu đồ báo cáo (Recharts)</w:t>
+              <w:t xml:space="preserve">- Bảo mật defense-in-depth</w:t>
             </w:r>
           </w:p>
         </w:tc>
@@ -2599,13 +2611,13 @@
               <w:pStyle w:val="Compact"/>
             </w:pPr>
             <w:r>
-              <w:t xml:space="preserve">- Lập trình Frontend Telegram Mini App (khách + shipper)</w:t>
-            </w:r>
-            <w:r>
-              <w:t xml:space="preserve">- Module giỏ hàng, checkout và bản đồ tracking (react-leaflet)</w:t>
+              <w:t xml:space="preserve">- Lập trình Frontend Telegram Mini App (khách + shipper): giỏ hàng, checkout, bản đồ tracking (react-leaflet)</w:t>
             </w:r>
             <w:r>
               <w:t xml:space="preserve">- Thiết kế giao diện và chuẩn bị presentation</w:t>
+            </w:r>
+            <w:r>
+              <w:t xml:space="preserve">- Tổng hợp, viết tài liệu và báo cáo khóa luận</w:t>
             </w:r>
           </w:p>
         </w:tc>
@@ -3607,7 +3619,7 @@
     <w:link w:val="BodyTextChar"/>
     <w:qFormat/>
     <w:pPr>
-      <w:spacing w:after="180" w:before="180"/>
+      <w:spacing w:after="60" w:before="60"/>
     </w:pPr>
   </w:style>
   <w:style w:customStyle="1" w:styleId="FirstParagraph" w:type="paragraph">
@@ -3621,7 +3633,7 @@
     <w:basedOn w:val="BodyText"/>
     <w:qFormat/>
     <w:pPr>
-      <w:spacing w:after="36" w:before="36"/>
+      <w:spacing w:after="20" w:before="20" w:line="240" w:lineRule="auto"/>
     </w:pPr>
   </w:style>
   <w:style w:styleId="Title" w:type="paragraph">
@@ -4242,18 +4254,55 @@
       <w:color w:themeColor="accent1" w:themeShade="BF" w:val="365F91"/>
     </w:rPr>
   </w:style>
-  <w:style w:type="paragraph" w:customStyle="1" w:styleId="TrangBia">
+  <w:style w:styleId="TrangBia" w:type="paragraph">
     <w:name w:val="TrangBia"/>
-    <w:basedOn w:val="BodyText"/>
+    <w:basedOn w:val="Normal"/>
     <w:qFormat/>
-  </w:style>
-  <w:style w:type="paragraph" w:customStyle="1" w:styleId="SourceCode">
+    <w:pPr>
+      <w:spacing w:after="0" w:before="0" w:line="276" w:lineRule="auto"/>
+      <w:ind w:firstLine="0"/>
+      <w:jc w:val="center"/>
+    </w:pPr>
+  </w:style>
+  <w:style w:styleId="TieuDeBia" w:type="paragraph">
+    <w:name w:val="TieuDeBia"/>
+    <w:basedOn w:val="Normal"/>
+    <w:qFormat/>
+    <w:pPr>
+      <w:spacing w:after="120" w:before="120" w:line="276" w:lineRule="auto"/>
+      <w:ind w:firstLine="0"/>
+      <w:jc w:val="center"/>
+    </w:pPr>
+    <w:rPr>
+      <w:b/>
+      <w:sz w:val="32"/>
+      <w:szCs w:val="32"/>
+    </w:rPr>
+  </w:style>
+  <w:style w:styleId="ChuKy" w:type="paragraph">
+    <w:name w:val="ChuKy"/>
+    <w:basedOn w:val="Normal"/>
+    <w:qFormat/>
+    <w:pPr>
+      <w:spacing w:after="0" w:before="0" w:line="276" w:lineRule="auto"/>
+      <w:ind w:firstLine="0" w:left="4820"/>
+      <w:jc w:val="center"/>
+    </w:pPr>
+  </w:style>
+  <w:style w:customStyle="1" w:styleId="SourceCode" w:type="paragraph">
     <w:name w:val="Source Code"/>
     <w:basedOn w:val="Normal"/>
-    <w:link w:val="VerbatimChar"/>
+    <w:qFormat/>
     <w:pPr>
-      <w:wordWrap w:val="off"/>
+      <w:spacing w:after="0" w:before="0" w:line="240" w:lineRule="auto"/>
+      <w:ind w:firstLine="0" w:left="170"/>
+      <w:contextualSpacing/>
     </w:pPr>
+    <w:rPr>
+      <w:rFonts w:ascii="Consolas" w:cs="Consolas" w:hAnsi="Consolas"/>
+      <w:sz w:val="20"/>
+      <w:szCs w:val="20"/>
+    </w:rPr>
   </w:style>
   <w:style w:type="character" w:customStyle="1" w:styleId="KeywordTok">
     <w:name w:val="KeywordTok"/>

</xml_diff>